<commit_message>
Update project report document
</commit_message>
<xml_diff>
--- a/chau0732/chau0732.docx
+++ b/chau0732/chau0732.docx
@@ -55,42 +55,21 @@
           <w:sz w:val="24"/>
           <w:szCs w:val="24"/>
         </w:rPr>
-        <w:t xml:space="preserve">FAN: </w:t>
+        <w:t>Author: Devendra</w:t>
       </w:r>
       <w:r>
         <w:rPr>
           <w:sz w:val="24"/>
           <w:szCs w:val="24"/>
-          <w:lang w:val="en-IN"/>
-        </w:rPr>
-        <w:t>2390829</w:t>
-      </w:r>
-    </w:p>
-    <w:p>
-      <w:pPr>
-        <w:spacing w:after="120"/>
-        <w:jc w:val="center"/>
-      </w:pPr>
+        </w:rPr>
+        <w:t xml:space="preserve"> </w:t>
+      </w:r>
       <w:r>
         <w:rPr>
           <w:sz w:val="24"/>
           <w:szCs w:val="24"/>
         </w:rPr>
-        <w:t>Author: Devendra</w:t>
-      </w:r>
-      <w:r>
-        <w:rPr>
-          <w:sz w:val="24"/>
-          <w:szCs w:val="24"/>
-        </w:rPr>
-        <w:t xml:space="preserve"> Hemant</w:t>
-      </w:r>
-      <w:r>
-        <w:rPr>
-          <w:sz w:val="24"/>
-          <w:szCs w:val="24"/>
-        </w:rPr>
-        <w:t xml:space="preserve"> Chaudhari</w:t>
+        <w:t>Chaudhari</w:t>
       </w:r>
     </w:p>
     <w:p>

</xml_diff>